<commit_message>
Add multiple staff accounts
- Staff Accounts section: list, add, edit, reset password, remove
- Records and shows when each person last signed in
- Cannot remove your own account or the last remaining one
- Password reset signs that person out everywhere
- User guide gains a Staff accounts section

Co-Authored-By: Claude Fable 5.1 <noreply@anthropic.com>
</commit_message>
<xml_diff>
--- a/docs/Admin-Panel-User-Guide.docx
+++ b/docs/Admin-Panel-User-Guide.docx
@@ -224,7 +224,23 @@
           <w:sz w:val="22"/>
           <w:szCs w:val="22"/>
         </w:rPr>
-        <w:t xml:space="preserve">If you type a wrong password five times, sign-in is paused for 15 minutes. If the password is forgotten, contact the developer to reset it.</w:t>
+        <w:t xml:space="preserve">If you type a wrong password five times, sign-in is paused for 15 minutes. If the password is forgotten, another staff member can reset it from </w:t>
+      </w:r>
+      <w:r>
+        <w:rPr>
+          <w:b/>
+          <w:bCs/>
+          <w:sz w:val="22"/>
+          <w:szCs w:val="22"/>
+        </w:rPr>
+        <w:t xml:space="preserve">Staff accounts</w:t>
+      </w:r>
+      <w:r>
+        <w:rPr>
+          <w:sz w:val="22"/>
+          <w:szCs w:val="22"/>
+        </w:rPr>
+        <w:t xml:space="preserve"> (section 10).</w:t>
       </w:r>
     </w:p>
     <w:p>
@@ -1484,7 +1500,7 @@
         <w:pStyle w:val="Heading1"/>
       </w:pPr>
       <w:r>
-        <w:t xml:space="preserve">10. Account &amp; Password</w:t>
+        <w:t xml:space="preserve">10. Staff accounts</w:t>
       </w:r>
     </w:p>
     <w:p>
@@ -1496,6 +1512,216 @@
           <w:sz w:val="22"/>
           <w:szCs w:val="22"/>
         </w:rPr>
+        <w:t xml:space="preserve">Anyone who needs to update the website gets their own account, so you can see who changed what and remove access when someone leaves.</w:t>
+      </w:r>
+    </w:p>
+    <w:p>
+      <w:pPr>
+        <w:pStyle w:val="ListParagraph"/>
+        <w:numPr>
+          <w:ilvl w:val="0"/>
+          <w:numId w:val="3"/>
+        </w:numPr>
+        <w:spacing w:after="70"/>
+      </w:pPr>
+      <w:r>
+        <w:rPr>
+          <w:b/>
+          <w:bCs/>
+          <w:sz w:val="22"/>
+          <w:szCs w:val="22"/>
+        </w:rPr>
+        <w:t xml:space="preserve">See who can sign in:</w:t>
+      </w:r>
+      <w:r>
+        <w:rPr>
+          <w:sz w:val="22"/>
+          <w:szCs w:val="22"/>
+        </w:rPr>
+        <w:t xml:space="preserve"> the list shows each person's name, username and when they last signed in. Your own row is marked </w:t>
+      </w:r>
+      <w:r>
+        <w:rPr>
+          <w:b/>
+          <w:bCs/>
+          <w:sz w:val="22"/>
+          <w:szCs w:val="22"/>
+        </w:rPr>
+        <w:t xml:space="preserve">You</w:t>
+      </w:r>
+      <w:r>
+        <w:rPr>
+          <w:sz w:val="22"/>
+          <w:szCs w:val="22"/>
+        </w:rPr>
+        <w:t xml:space="preserve">.</w:t>
+      </w:r>
+    </w:p>
+    <w:p>
+      <w:pPr>
+        <w:pStyle w:val="ListParagraph"/>
+        <w:numPr>
+          <w:ilvl w:val="0"/>
+          <w:numId w:val="3"/>
+        </w:numPr>
+        <w:spacing w:after="70"/>
+      </w:pPr>
+      <w:r>
+        <w:rPr>
+          <w:b/>
+          <w:bCs/>
+          <w:sz w:val="22"/>
+          <w:szCs w:val="22"/>
+        </w:rPr>
+        <w:t xml:space="preserve">Add someone:</w:t>
+      </w:r>
+      <w:r>
+        <w:rPr>
+          <w:sz w:val="22"/>
+          <w:szCs w:val="22"/>
+        </w:rPr>
+        <w:t xml:space="preserve"> click </w:t>
+      </w:r>
+      <w:r>
+        <w:rPr>
+          <w:b/>
+          <w:bCs/>
+          <w:sz w:val="22"/>
+          <w:szCs w:val="22"/>
+        </w:rPr>
+        <w:t xml:space="preserve">Add account</w:t>
+      </w:r>
+      <w:r>
+        <w:rPr>
+          <w:sz w:val="22"/>
+          <w:szCs w:val="22"/>
+        </w:rPr>
+        <w:t xml:space="preserve">, enter their name, a username (lower-case letters, numbers, dot, dash or underscore) and a first password. Tell them the password and ask them to change it after signing in.</w:t>
+      </w:r>
+    </w:p>
+    <w:p>
+      <w:pPr>
+        <w:pStyle w:val="ListParagraph"/>
+        <w:numPr>
+          <w:ilvl w:val="0"/>
+          <w:numId w:val="3"/>
+        </w:numPr>
+        <w:spacing w:after="70"/>
+      </w:pPr>
+      <w:r>
+        <w:rPr>
+          <w:b/>
+          <w:bCs/>
+          <w:sz w:val="22"/>
+          <w:szCs w:val="22"/>
+        </w:rPr>
+        <w:t xml:space="preserve">Edit:</w:t>
+      </w:r>
+      <w:r>
+        <w:rPr>
+          <w:sz w:val="22"/>
+          <w:szCs w:val="22"/>
+        </w:rPr>
+        <w:t xml:space="preserve"> the pencil icon changes a person's name or username.</w:t>
+      </w:r>
+    </w:p>
+    <w:p>
+      <w:pPr>
+        <w:pStyle w:val="ListParagraph"/>
+        <w:numPr>
+          <w:ilvl w:val="0"/>
+          <w:numId w:val="3"/>
+        </w:numPr>
+        <w:spacing w:after="70"/>
+      </w:pPr>
+      <w:r>
+        <w:rPr>
+          <w:b/>
+          <w:bCs/>
+          <w:sz w:val="22"/>
+          <w:szCs w:val="22"/>
+        </w:rPr>
+        <w:t xml:space="preserve">Forgotten password:</w:t>
+      </w:r>
+      <w:r>
+        <w:rPr>
+          <w:sz w:val="22"/>
+          <w:szCs w:val="22"/>
+        </w:rPr>
+        <w:t xml:space="preserve"> open that person from the list and use </w:t>
+      </w:r>
+      <w:r>
+        <w:rPr>
+          <w:b/>
+          <w:bCs/>
+          <w:sz w:val="22"/>
+          <w:szCs w:val="22"/>
+        </w:rPr>
+        <w:t xml:space="preserve">Set new password</w:t>
+      </w:r>
+      <w:r>
+        <w:rPr>
+          <w:sz w:val="22"/>
+          <w:szCs w:val="22"/>
+        </w:rPr>
+        <w:t xml:space="preserve">. They are signed out everywhere and must use the new one.</w:t>
+      </w:r>
+    </w:p>
+    <w:p>
+      <w:pPr>
+        <w:pStyle w:val="ListParagraph"/>
+        <w:numPr>
+          <w:ilvl w:val="0"/>
+          <w:numId w:val="3"/>
+        </w:numPr>
+        <w:spacing w:after="70"/>
+      </w:pPr>
+      <w:r>
+        <w:rPr>
+          <w:b/>
+          <w:bCs/>
+          <w:sz w:val="22"/>
+          <w:szCs w:val="22"/>
+        </w:rPr>
+        <w:t xml:space="preserve">Remove someone:</w:t>
+      </w:r>
+      <w:r>
+        <w:rPr>
+          <w:sz w:val="22"/>
+          <w:szCs w:val="22"/>
+        </w:rPr>
+        <w:t xml:space="preserve"> the red bin icon. They can no longer sign in.</w:t>
+      </w:r>
+    </w:p>
+    <w:p>
+      <w:pPr>
+        <w:spacing w:after="140"/>
+      </w:pPr>
+      <w:r>
+        <w:rPr>
+          <w:sz w:val="22"/>
+          <w:szCs w:val="22"/>
+        </w:rPr>
+        <w:t xml:space="preserve">All accounts have the same access. You cannot remove your own account, and the last remaining account cannot be removed, so the school is never locked out.</w:t>
+      </w:r>
+    </w:p>
+    <w:p>
+      <w:pPr>
+        <w:pStyle w:val="Heading1"/>
+      </w:pPr>
+      <w:r>
+        <w:t xml:space="preserve">11. Account &amp; Password</w:t>
+      </w:r>
+    </w:p>
+    <w:p>
+      <w:pPr>
+        <w:spacing w:after="140"/>
+      </w:pPr>
+      <w:r>
+        <w:rPr>
+          <w:sz w:val="22"/>
+          <w:szCs w:val="22"/>
+        </w:rPr>
         <w:t xml:space="preserve">Change the staff password here: enter the current password, then the new one twice. Use at least 8 characters with both letters and numbers. After a change, any other device that was signed in must sign in again.</w:t>
       </w:r>
     </w:p>
@@ -1504,7 +1730,7 @@
         <w:pStyle w:val="Heading1"/>
       </w:pPr>
       <w:r>
-        <w:t xml:space="preserve">11. Good habits</w:t>
+        <w:t xml:space="preserve">12. Good habits</w:t>
       </w:r>
     </w:p>
     <w:p>
@@ -1632,7 +1858,7 @@
         <w:pStyle w:val="Heading1"/>
       </w:pPr>
       <w:r>
-        <w:t xml:space="preserve">12. If something goes wrong</w:t>
+        <w:t xml:space="preserve">13. If something goes wrong</w:t>
       </w:r>
     </w:p>
     <w:tbl>
@@ -1978,6 +2204,83 @@
           </w:p>
         </w:tc>
       </w:tr>
+      <w:tr>
+        <w:trPr>
+          <w:cantSplit/>
+        </w:trPr>
+        <w:tc>
+          <w:tcPr>
+            <w:tcW w:type="dxa" w:w="3662"/>
+            <w:tcBorders>
+              <w:top w:val="single" w:color="C8CCD8" w:sz="4"/>
+              <w:left w:val="single" w:color="C8CCD8" w:sz="4"/>
+              <w:bottom w:val="single" w:color="C8CCD8" w:sz="4"/>
+              <w:right w:val="single" w:color="C8CCD8" w:sz="4"/>
+            </w:tcBorders>
+            <w:tcMar>
+              <w:top w:type="dxa" w:w="80"/>
+              <w:left w:type="dxa" w:w="120"/>
+              <w:bottom w:type="dxa" w:w="80"/>
+              <w:right w:type="dxa" w:w="120"/>
+            </w:tcMar>
+          </w:tcPr>
+          <w:p>
+            <w:pPr>
+              <w:spacing w:after="0"/>
+            </w:pPr>
+            <w:r>
+              <w:rPr>
+                <w:sz w:val="20"/>
+                <w:szCs w:val="20"/>
+              </w:rPr>
+              <w:t xml:space="preserve">Someone forgot their password</w:t>
+            </w:r>
+          </w:p>
+        </w:tc>
+        <w:tc>
+          <w:tcPr>
+            <w:tcW w:type="dxa" w:w="5976"/>
+            <w:tcBorders>
+              <w:top w:val="single" w:color="C8CCD8" w:sz="4"/>
+              <w:left w:val="single" w:color="C8CCD8" w:sz="4"/>
+              <w:bottom w:val="single" w:color="C8CCD8" w:sz="4"/>
+              <w:right w:val="single" w:color="C8CCD8" w:sz="4"/>
+            </w:tcBorders>
+            <w:tcMar>
+              <w:top w:type="dxa" w:w="80"/>
+              <w:left w:type="dxa" w:w="120"/>
+              <w:bottom w:type="dxa" w:w="80"/>
+              <w:right w:type="dxa" w:w="120"/>
+            </w:tcMar>
+          </w:tcPr>
+          <w:p>
+            <w:pPr>
+              <w:spacing w:after="0"/>
+            </w:pPr>
+            <w:r>
+              <w:rPr>
+                <w:sz w:val="20"/>
+                <w:szCs w:val="20"/>
+              </w:rPr>
+              <w:t xml:space="preserve">Another staff member can reset it from </w:t>
+            </w:r>
+            <w:r>
+              <w:rPr>
+                <w:sz w:val="20"/>
+                <w:szCs w:val="20"/>
+              </w:rPr>
+              <w:t xml:space="preserve">Staff accounts</w:t>
+            </w:r>
+            <w:r>
+              <w:rPr>
+                <w:sz w:val="20"/>
+                <w:szCs w:val="20"/>
+              </w:rPr>
+              <w:t xml:space="preserve">.</w:t>
+            </w:r>
+          </w:p>
+        </w:tc>
+      </w:tr>
     </w:tbl>
     <w:p>
       <w:pPr>

</xml_diff>

<commit_message>
Add an activity log of who changed what and when
- audit_log table; every create, edit, delete, re-order and upload is recorded
- Records sign-ins, sign-outs, password changes and staff-account changes
- Edits store a before/after diff, shown under 'What changed'
- Activity Log page: filter by section or person, search (including changed
  values), paginate, export to CSV
- Entries cannot be edited or deleted from the panel
- User guide gains an Activity log section

Co-Authored-By: Claude Fable 5.1 <noreply@anthropic.com>
</commit_message>
<xml_diff>
--- a/docs/Admin-Panel-User-Guide.docx
+++ b/docs/Admin-Panel-User-Guide.docx
@@ -1710,7 +1710,7 @@
         <w:pStyle w:val="Heading1"/>
       </w:pPr>
       <w:r>
-        <w:t xml:space="preserve">11. Account &amp; Password</w:t>
+        <w:t xml:space="preserve">11. Activity log</w:t>
       </w:r>
     </w:p>
     <w:p>
@@ -1722,41 +1722,88 @@
           <w:sz w:val="22"/>
           <w:szCs w:val="22"/>
         </w:rPr>
-        <w:t xml:space="preserve">Change the staff password here: enter the current password, then the new one twice. Use at least 8 characters with both letters and numbers. After a change, any other device that was signed in must sign in again.</w:t>
-      </w:r>
-    </w:p>
-    <w:p>
-      <w:pPr>
-        <w:pStyle w:val="Heading1"/>
-      </w:pPr>
-      <w:r>
-        <w:t xml:space="preserve">12. Good habits</w:t>
-      </w:r>
-    </w:p>
-    <w:p>
-      <w:pPr>
-        <w:pStyle w:val="ListParagraph"/>
-        <w:numPr>
-          <w:ilvl w:val="0"/>
-          <w:numId w:val="3"/>
-        </w:numPr>
-        <w:spacing w:after="70"/>
-      </w:pPr>
-      <w:r>
-        <w:rPr>
-          <w:b/>
-          <w:bCs/>
-          <w:sz w:val="22"/>
-          <w:szCs w:val="22"/>
-        </w:rPr>
-        <w:t xml:space="preserve">Check the website</w:t>
-      </w:r>
-      <w:r>
-        <w:rPr>
-          <w:sz w:val="22"/>
-          <w:szCs w:val="22"/>
-        </w:rPr>
-        <w:t xml:space="preserve"> after saving: each section has a </w:t>
+        <w:t xml:space="preserve">A permanent record of everything done in this panel, newest first.</w:t>
+      </w:r>
+    </w:p>
+    <w:p>
+      <w:pPr>
+        <w:pStyle w:val="ListParagraph"/>
+        <w:numPr>
+          <w:ilvl w:val="0"/>
+          <w:numId w:val="3"/>
+        </w:numPr>
+        <w:spacing w:after="70"/>
+      </w:pPr>
+      <w:r>
+        <w:rPr>
+          <w:sz w:val="22"/>
+          <w:szCs w:val="22"/>
+        </w:rPr>
+        <w:t xml:space="preserve">Each line shows </w:t>
+      </w:r>
+      <w:r>
+        <w:rPr>
+          <w:b/>
+          <w:bCs/>
+          <w:sz w:val="22"/>
+          <w:szCs w:val="22"/>
+        </w:rPr>
+        <w:t xml:space="preserve">when</w:t>
+      </w:r>
+      <w:r>
+        <w:rPr>
+          <w:sz w:val="22"/>
+          <w:szCs w:val="22"/>
+        </w:rPr>
+        <w:t xml:space="preserve"> it happened, </w:t>
+      </w:r>
+      <w:r>
+        <w:rPr>
+          <w:b/>
+          <w:bCs/>
+          <w:sz w:val="22"/>
+          <w:szCs w:val="22"/>
+        </w:rPr>
+        <w:t xml:space="preserve">who</w:t>
+      </w:r>
+      <w:r>
+        <w:rPr>
+          <w:sz w:val="22"/>
+          <w:szCs w:val="22"/>
+        </w:rPr>
+        <w:t xml:space="preserve"> did it, which </w:t>
+      </w:r>
+      <w:r>
+        <w:rPr>
+          <w:b/>
+          <w:bCs/>
+          <w:sz w:val="22"/>
+          <w:szCs w:val="22"/>
+        </w:rPr>
+        <w:t xml:space="preserve">section</w:t>
+      </w:r>
+      <w:r>
+        <w:rPr>
+          <w:sz w:val="22"/>
+          <w:szCs w:val="22"/>
+        </w:rPr>
+        <w:t xml:space="preserve"> it was in, and </w:t>
+      </w:r>
+      <w:r>
+        <w:rPr>
+          <w:b/>
+          <w:bCs/>
+          <w:sz w:val="22"/>
+          <w:szCs w:val="22"/>
+        </w:rPr>
+        <w:t xml:space="preserve">what happened</w:t>
+      </w:r>
+      <w:r>
+        <w:rPr>
+          <w:sz w:val="22"/>
+          <w:szCs w:val="22"/>
+        </w:rPr>
+        <w:t xml:space="preserve"> — for example </w:t>
       </w:r>
       <w:r>
         <w:rPr>
@@ -1765,6 +1812,181 @@
           <w:sz w:val="22"/>
           <w:szCs w:val="22"/>
         </w:rPr>
+        <w:t xml:space="preserve">Added the notice "Sports Day"</w:t>
+      </w:r>
+      <w:r>
+        <w:rPr>
+          <w:sz w:val="22"/>
+          <w:szCs w:val="22"/>
+        </w:rPr>
+        <w:t xml:space="preserve">.</w:t>
+      </w:r>
+    </w:p>
+    <w:p>
+      <w:pPr>
+        <w:pStyle w:val="ListParagraph"/>
+        <w:numPr>
+          <w:ilvl w:val="0"/>
+          <w:numId w:val="3"/>
+        </w:numPr>
+        <w:spacing w:after="70"/>
+      </w:pPr>
+      <w:r>
+        <w:rPr>
+          <w:sz w:val="22"/>
+          <w:szCs w:val="22"/>
+        </w:rPr>
+        <w:t xml:space="preserve">Where something was edited, </w:t>
+      </w:r>
+      <w:r>
+        <w:rPr>
+          <w:b/>
+          <w:bCs/>
+          <w:sz w:val="22"/>
+          <w:szCs w:val="22"/>
+        </w:rPr>
+        <w:t xml:space="preserve">What changed</w:t>
+      </w:r>
+      <w:r>
+        <w:rPr>
+          <w:sz w:val="22"/>
+          <w:szCs w:val="22"/>
+        </w:rPr>
+        <w:t xml:space="preserve"> opens to show the old and new values side by side.</w:t>
+      </w:r>
+    </w:p>
+    <w:p>
+      <w:pPr>
+        <w:pStyle w:val="ListParagraph"/>
+        <w:numPr>
+          <w:ilvl w:val="0"/>
+          <w:numId w:val="3"/>
+        </w:numPr>
+        <w:spacing w:after="70"/>
+      </w:pPr>
+      <w:r>
+        <w:rPr>
+          <w:sz w:val="22"/>
+          <w:szCs w:val="22"/>
+        </w:rPr>
+        <w:t xml:space="preserve">Filter by section or by person, or search for a word. The search also looks inside the changed values, so searching "phone" finds the day someone changed the phone number.</w:t>
+      </w:r>
+    </w:p>
+    <w:p>
+      <w:pPr>
+        <w:pStyle w:val="ListParagraph"/>
+        <w:numPr>
+          <w:ilvl w:val="0"/>
+          <w:numId w:val="3"/>
+        </w:numPr>
+        <w:spacing w:after="70"/>
+      </w:pPr>
+      <w:r>
+        <w:rPr>
+          <w:b/>
+          <w:bCs/>
+          <w:sz w:val="22"/>
+          <w:szCs w:val="22"/>
+        </w:rPr>
+        <w:t xml:space="preserve">Export (CSV)</w:t>
+      </w:r>
+      <w:r>
+        <w:rPr>
+          <w:sz w:val="22"/>
+          <w:szCs w:val="22"/>
+        </w:rPr>
+        <w:t xml:space="preserve"> downloads the list, respecting whatever filters you set.</w:t>
+      </w:r>
+    </w:p>
+    <w:p>
+      <w:pPr>
+        <w:pStyle w:val="ListParagraph"/>
+        <w:numPr>
+          <w:ilvl w:val="0"/>
+          <w:numId w:val="3"/>
+        </w:numPr>
+        <w:spacing w:after="70"/>
+      </w:pPr>
+      <w:r>
+        <w:rPr>
+          <w:sz w:val="22"/>
+          <w:szCs w:val="22"/>
+        </w:rPr>
+        <w:t xml:space="preserve">Sign-ins and sign-outs are recorded too.</w:t>
+      </w:r>
+    </w:p>
+    <w:p>
+      <w:pPr>
+        <w:spacing w:after="140"/>
+      </w:pPr>
+      <w:r>
+        <w:rPr>
+          <w:sz w:val="22"/>
+          <w:szCs w:val="22"/>
+        </w:rPr>
+        <w:t xml:space="preserve">Entries cannot be edited or deleted from the panel, so the record stays trustworthy.</w:t>
+      </w:r>
+    </w:p>
+    <w:p>
+      <w:pPr>
+        <w:pStyle w:val="Heading1"/>
+      </w:pPr>
+      <w:r>
+        <w:t xml:space="preserve">12. Account &amp; Password</w:t>
+      </w:r>
+    </w:p>
+    <w:p>
+      <w:pPr>
+        <w:spacing w:after="140"/>
+      </w:pPr>
+      <w:r>
+        <w:rPr>
+          <w:sz w:val="22"/>
+          <w:szCs w:val="22"/>
+        </w:rPr>
+        <w:t xml:space="preserve">Change the staff password here: enter the current password, then the new one twice. Use at least 8 characters with both letters and numbers. After a change, any other device that was signed in must sign in again.</w:t>
+      </w:r>
+    </w:p>
+    <w:p>
+      <w:pPr>
+        <w:pStyle w:val="Heading1"/>
+      </w:pPr>
+      <w:r>
+        <w:t xml:space="preserve">13. Good habits</w:t>
+      </w:r>
+    </w:p>
+    <w:p>
+      <w:pPr>
+        <w:pStyle w:val="ListParagraph"/>
+        <w:numPr>
+          <w:ilvl w:val="0"/>
+          <w:numId w:val="3"/>
+        </w:numPr>
+        <w:spacing w:after="70"/>
+      </w:pPr>
+      <w:r>
+        <w:rPr>
+          <w:b/>
+          <w:bCs/>
+          <w:sz w:val="22"/>
+          <w:szCs w:val="22"/>
+        </w:rPr>
+        <w:t xml:space="preserve">Check the website</w:t>
+      </w:r>
+      <w:r>
+        <w:rPr>
+          <w:sz w:val="22"/>
+          <w:szCs w:val="22"/>
+        </w:rPr>
+        <w:t xml:space="preserve"> after saving: each section has a </w:t>
+      </w:r>
+      <w:r>
+        <w:rPr>
+          <w:i/>
+          <w:iCs/>
+          <w:sz w:val="22"/>
+          <w:szCs w:val="22"/>
+        </w:rPr>
         <w:t xml:space="preserve">View on website</w:t>
       </w:r>
       <w:r>
@@ -1817,6 +2039,32 @@
           <w:sz w:val="22"/>
           <w:szCs w:val="22"/>
         </w:rPr>
+        <w:t xml:space="preserve">Check the activity log</w:t>
+      </w:r>
+      <w:r>
+        <w:rPr>
+          <w:sz w:val="22"/>
+          <w:szCs w:val="22"/>
+        </w:rPr>
+        <w:t xml:space="preserve"> if you are unsure who changed something.</w:t>
+      </w:r>
+    </w:p>
+    <w:p>
+      <w:pPr>
+        <w:pStyle w:val="ListParagraph"/>
+        <w:numPr>
+          <w:ilvl w:val="0"/>
+          <w:numId w:val="3"/>
+        </w:numPr>
+        <w:spacing w:after="70"/>
+      </w:pPr>
+      <w:r>
+        <w:rPr>
+          <w:b/>
+          <w:bCs/>
+          <w:sz w:val="22"/>
+          <w:szCs w:val="22"/>
+        </w:rPr>
         <w:t xml:space="preserve">Photos:</w:t>
       </w:r>
       <w:r>
@@ -1858,7 +2106,7 @@
         <w:pStyle w:val="Heading1"/>
       </w:pPr>
       <w:r>
-        <w:t xml:space="preserve">13. If something goes wrong</w:t>
+        <w:t xml:space="preserve">14. If something goes wrong</w:t>
       </w:r>
     </w:p>
     <w:tbl>

</xml_diff>

<commit_message>
Add rich-text descriptions to notices and events
- description column on notices and events, authored with a small Tiptap editor
  (bold, italic, bullet and numbered lists, quote, link, undo/redo)
- HTML sanitised with a strict allowlist on save and again on render; links get
  target and rel; scripts, images, iframes and event handlers are stripped
- Descriptions shown under each notice and event on the public Notices page
- Admin lists show a one-line preview; the activity log records description
  changes as plain text
- User guide updated

Co-Authored-By: Claude Fable 5.1 <noreply@anthropic.com>
</commit_message>
<xml_diff>
--- a/docs/Admin-Panel-User-Guide.docx
+++ b/docs/Admin-Panel-User-Guide.docx
@@ -427,102 +427,30 @@
           <w:sz w:val="22"/>
           <w:szCs w:val="22"/>
         </w:rPr>
-        <w:t xml:space="preserve">Edit:</w:t>
-      </w:r>
-      <w:r>
-        <w:rPr>
-          <w:sz w:val="22"/>
-          <w:szCs w:val="22"/>
-        </w:rPr>
-        <w:t xml:space="preserve"> click the pencil icon, change what you need, </w:t>
-      </w:r>
-      <w:r>
-        <w:rPr>
-          <w:b/>
-          <w:bCs/>
-          <w:sz w:val="22"/>
-          <w:szCs w:val="22"/>
-        </w:rPr>
-        <w:t xml:space="preserve">Save changes</w:t>
-      </w:r>
-      <w:r>
-        <w:rPr>
-          <w:sz w:val="22"/>
-          <w:szCs w:val="22"/>
-        </w:rPr>
-        <w:t xml:space="preserve">.</w:t>
-      </w:r>
-    </w:p>
-    <w:p>
-      <w:pPr>
-        <w:pStyle w:val="ListParagraph"/>
-        <w:numPr>
-          <w:ilvl w:val="0"/>
-          <w:numId w:val="3"/>
-        </w:numPr>
-        <w:spacing w:after="70"/>
-      </w:pPr>
-      <w:r>
-        <w:rPr>
-          <w:b/>
-          <w:bCs/>
-          <w:sz w:val="22"/>
-          <w:szCs w:val="22"/>
-        </w:rPr>
-        <w:t xml:space="preserve">Change the order:</w:t>
-      </w:r>
-      <w:r>
-        <w:rPr>
-          <w:sz w:val="22"/>
-          <w:szCs w:val="22"/>
-        </w:rPr>
-        <w:t xml:space="preserve"> use the ↑ ↓ arrows. The website follows this order.</w:t>
-      </w:r>
-    </w:p>
-    <w:p>
-      <w:pPr>
-        <w:pStyle w:val="ListParagraph"/>
-        <w:numPr>
-          <w:ilvl w:val="0"/>
-          <w:numId w:val="3"/>
-        </w:numPr>
-        <w:spacing w:after="70"/>
-      </w:pPr>
-      <w:r>
-        <w:rPr>
-          <w:b/>
-          <w:bCs/>
-          <w:sz w:val="22"/>
-          <w:szCs w:val="22"/>
-        </w:rPr>
-        <w:t xml:space="preserve">Delete:</w:t>
-      </w:r>
-      <w:r>
-        <w:rPr>
-          <w:sz w:val="22"/>
-          <w:szCs w:val="22"/>
-        </w:rPr>
-        <w:t xml:space="preserve"> click the red bin icon and confirm.</w:t>
-      </w:r>
-    </w:p>
-    <w:p>
-      <w:pPr>
-        <w:pStyle w:val="Heading1"/>
-      </w:pPr>
-      <w:r>
-        <w:t xml:space="preserve">4. Events</w:t>
-      </w:r>
-    </w:p>
-    <w:p>
-      <w:pPr>
-        <w:spacing w:after="140"/>
-      </w:pPr>
-      <w:r>
-        <w:rPr>
-          <w:sz w:val="22"/>
-          <w:szCs w:val="22"/>
-        </w:rPr>
-        <w:t xml:space="preserve">Events appear beside the notice board as </w:t>
+        <w:t xml:space="preserve">Description (optional):</w:t>
+      </w:r>
+      <w:r>
+        <w:rPr>
+          <w:sz w:val="22"/>
+          <w:szCs w:val="22"/>
+        </w:rPr>
+        <w:t xml:space="preserve"> the box below the category is a rich text field. Use the small toolbar for </w:t>
+      </w:r>
+      <w:r>
+        <w:rPr>
+          <w:b/>
+          <w:bCs/>
+          <w:sz w:val="22"/>
+          <w:szCs w:val="22"/>
+        </w:rPr>
+        <w:t xml:space="preserve">bold</w:t>
+      </w:r>
+      <w:r>
+        <w:rPr>
+          <w:sz w:val="22"/>
+          <w:szCs w:val="22"/>
+        </w:rPr>
+        <w:t xml:space="preserve">, </w:t>
       </w:r>
       <w:r>
         <w:rPr>
@@ -531,6 +459,136 @@
           <w:sz w:val="22"/>
           <w:szCs w:val="22"/>
         </w:rPr>
+        <w:t xml:space="preserve">italic</w:t>
+      </w:r>
+      <w:r>
+        <w:rPr>
+          <w:sz w:val="22"/>
+          <w:szCs w:val="22"/>
+        </w:rPr>
+        <w:t xml:space="preserve">, bulleted and numbered lists, quotes and links, with undo and redo. The description appears under the notice on the website's Notices page. Leave it empty for a one-line notice.</w:t>
+      </w:r>
+    </w:p>
+    <w:p>
+      <w:pPr>
+        <w:pStyle w:val="ListParagraph"/>
+        <w:numPr>
+          <w:ilvl w:val="0"/>
+          <w:numId w:val="3"/>
+        </w:numPr>
+        <w:spacing w:after="70"/>
+      </w:pPr>
+      <w:r>
+        <w:rPr>
+          <w:b/>
+          <w:bCs/>
+          <w:sz w:val="22"/>
+          <w:szCs w:val="22"/>
+        </w:rPr>
+        <w:t xml:space="preserve">Edit:</w:t>
+      </w:r>
+      <w:r>
+        <w:rPr>
+          <w:sz w:val="22"/>
+          <w:szCs w:val="22"/>
+        </w:rPr>
+        <w:t xml:space="preserve"> click the pencil icon, change what you need, </w:t>
+      </w:r>
+      <w:r>
+        <w:rPr>
+          <w:b/>
+          <w:bCs/>
+          <w:sz w:val="22"/>
+          <w:szCs w:val="22"/>
+        </w:rPr>
+        <w:t xml:space="preserve">Save changes</w:t>
+      </w:r>
+      <w:r>
+        <w:rPr>
+          <w:sz w:val="22"/>
+          <w:szCs w:val="22"/>
+        </w:rPr>
+        <w:t xml:space="preserve">.</w:t>
+      </w:r>
+    </w:p>
+    <w:p>
+      <w:pPr>
+        <w:pStyle w:val="ListParagraph"/>
+        <w:numPr>
+          <w:ilvl w:val="0"/>
+          <w:numId w:val="3"/>
+        </w:numPr>
+        <w:spacing w:after="70"/>
+      </w:pPr>
+      <w:r>
+        <w:rPr>
+          <w:b/>
+          <w:bCs/>
+          <w:sz w:val="22"/>
+          <w:szCs w:val="22"/>
+        </w:rPr>
+        <w:t xml:space="preserve">Change the order:</w:t>
+      </w:r>
+      <w:r>
+        <w:rPr>
+          <w:sz w:val="22"/>
+          <w:szCs w:val="22"/>
+        </w:rPr>
+        <w:t xml:space="preserve"> use the ↑ ↓ arrows. The website follows this order.</w:t>
+      </w:r>
+    </w:p>
+    <w:p>
+      <w:pPr>
+        <w:pStyle w:val="ListParagraph"/>
+        <w:numPr>
+          <w:ilvl w:val="0"/>
+          <w:numId w:val="3"/>
+        </w:numPr>
+        <w:spacing w:after="70"/>
+      </w:pPr>
+      <w:r>
+        <w:rPr>
+          <w:b/>
+          <w:bCs/>
+          <w:sz w:val="22"/>
+          <w:szCs w:val="22"/>
+        </w:rPr>
+        <w:t xml:space="preserve">Delete:</w:t>
+      </w:r>
+      <w:r>
+        <w:rPr>
+          <w:sz w:val="22"/>
+          <w:szCs w:val="22"/>
+        </w:rPr>
+        <w:t xml:space="preserve"> click the red bin icon and confirm.</w:t>
+      </w:r>
+    </w:p>
+    <w:p>
+      <w:pPr>
+        <w:pStyle w:val="Heading1"/>
+      </w:pPr>
+      <w:r>
+        <w:t xml:space="preserve">4. Events</w:t>
+      </w:r>
+    </w:p>
+    <w:p>
+      <w:pPr>
+        <w:spacing w:after="140"/>
+      </w:pPr>
+      <w:r>
+        <w:rPr>
+          <w:sz w:val="22"/>
+          <w:szCs w:val="22"/>
+        </w:rPr>
+        <w:t xml:space="preserve">Events appear beside the notice board as </w:t>
+      </w:r>
+      <w:r>
+        <w:rPr>
+          <w:i/>
+          <w:iCs/>
+          <w:sz w:val="22"/>
+          <w:szCs w:val="22"/>
+        </w:rPr>
         <w:t xml:space="preserve">Upcoming Events</w:t>
       </w:r>
       <w:r>
@@ -597,6 +655,32 @@
           <w:szCs w:val="22"/>
         </w:rPr>
         <w:t xml:space="preserve">.</w:t>
+      </w:r>
+    </w:p>
+    <w:p>
+      <w:pPr>
+        <w:pStyle w:val="ListParagraph"/>
+        <w:numPr>
+          <w:ilvl w:val="0"/>
+          <w:numId w:val="3"/>
+        </w:numPr>
+        <w:spacing w:after="70"/>
+      </w:pPr>
+      <w:r>
+        <w:rPr>
+          <w:b/>
+          <w:bCs/>
+          <w:sz w:val="22"/>
+          <w:szCs w:val="22"/>
+        </w:rPr>
+        <w:t xml:space="preserve">Description (optional):</w:t>
+      </w:r>
+      <w:r>
+        <w:rPr>
+          <w:sz w:val="22"/>
+          <w:szCs w:val="22"/>
+        </w:rPr>
+        <w:t xml:space="preserve"> same rich text field as notices — bold, lists, links and so on. It appears under the event on the Notices page.</w:t>
       </w:r>
     </w:p>
     <w:p>
@@ -2417,6 +2501,70 @@
                 <w:sz w:val="20"/>
                 <w:szCs w:val="20"/>
               </w:rPr>
+              <w:t xml:space="preserve">Formatting looks wrong after pasting</w:t>
+            </w:r>
+          </w:p>
+        </w:tc>
+        <w:tc>
+          <w:tcPr>
+            <w:tcW w:type="dxa" w:w="5976"/>
+            <w:tcBorders>
+              <w:top w:val="single" w:color="C8CCD8" w:sz="4"/>
+              <w:left w:val="single" w:color="C8CCD8" w:sz="4"/>
+              <w:bottom w:val="single" w:color="C8CCD8" w:sz="4"/>
+              <w:right w:val="single" w:color="C8CCD8" w:sz="4"/>
+            </w:tcBorders>
+            <w:shd w:fill="F3F5FA" w:color="auto" w:val="clear"/>
+            <w:tcMar>
+              <w:top w:type="dxa" w:w="80"/>
+              <w:left w:type="dxa" w:w="120"/>
+              <w:bottom w:type="dxa" w:w="80"/>
+              <w:right w:type="dxa" w:w="120"/>
+            </w:tcMar>
+          </w:tcPr>
+          <w:p>
+            <w:pPr>
+              <w:spacing w:after="0"/>
+            </w:pPr>
+            <w:r>
+              <w:rPr>
+                <w:sz w:val="20"/>
+                <w:szCs w:val="20"/>
+              </w:rPr>
+              <w:t xml:space="preserve">Paste is cleaned automatically; only bold, italic, lists, quotes and links are kept.</w:t>
+            </w:r>
+          </w:p>
+        </w:tc>
+      </w:tr>
+      <w:tr>
+        <w:trPr>
+          <w:cantSplit/>
+        </w:trPr>
+        <w:tc>
+          <w:tcPr>
+            <w:tcW w:type="dxa" w:w="3662"/>
+            <w:tcBorders>
+              <w:top w:val="single" w:color="C8CCD8" w:sz="4"/>
+              <w:left w:val="single" w:color="C8CCD8" w:sz="4"/>
+              <w:bottom w:val="single" w:color="C8CCD8" w:sz="4"/>
+              <w:right w:val="single" w:color="C8CCD8" w:sz="4"/>
+            </w:tcBorders>
+            <w:tcMar>
+              <w:top w:type="dxa" w:w="80"/>
+              <w:left w:type="dxa" w:w="120"/>
+              <w:bottom w:type="dxa" w:w="80"/>
+              <w:right w:type="dxa" w:w="120"/>
+            </w:tcMar>
+          </w:tcPr>
+          <w:p>
+            <w:pPr>
+              <w:spacing w:after="0"/>
+            </w:pPr>
+            <w:r>
+              <w:rPr>
+                <w:sz w:val="20"/>
+                <w:szCs w:val="20"/>
+              </w:rPr>
               <w:t xml:space="preserve">Signed out unexpectedly</w:t>
             </w:r>
           </w:p>
@@ -2430,7 +2578,6 @@
               <w:bottom w:val="single" w:color="C8CCD8" w:sz="4"/>
               <w:right w:val="single" w:color="C8CCD8" w:sz="4"/>
             </w:tcBorders>
-            <w:shd w:fill="F3F5FA" w:color="auto" w:val="clear"/>
             <w:tcMar>
               <w:top w:type="dxa" w:w="80"/>
               <w:left w:type="dxa" w:w="120"/>
@@ -2465,6 +2612,7 @@
               <w:bottom w:val="single" w:color="C8CCD8" w:sz="4"/>
               <w:right w:val="single" w:color="C8CCD8" w:sz="4"/>
             </w:tcBorders>
+            <w:shd w:fill="F3F5FA" w:color="auto" w:val="clear"/>
             <w:tcMar>
               <w:top w:type="dxa" w:w="80"/>
               <w:left w:type="dxa" w:w="120"/>
@@ -2494,6 +2642,7 @@
               <w:bottom w:val="single" w:color="C8CCD8" w:sz="4"/>
               <w:right w:val="single" w:color="C8CCD8" w:sz="4"/>
             </w:tcBorders>
+            <w:shd w:fill="F3F5FA" w:color="auto" w:val="clear"/>
             <w:tcMar>
               <w:top w:type="dxa" w:w="80"/>
               <w:left w:type="dxa" w:w="120"/>

</xml_diff>

<commit_message>
Add active/inactive status to notices and events, and tighten responsive layout
- active column on notices and events; inactive items stay in the panel but
  are hidden from the website (an event must also be dated today or later)
- Status set on the form and switched with one click from the list; the
  activity log records who showed or hid an item
- Row editors (admission dates, fees, timings) stack into labelled cards on a
  phone instead of squeezing into ~96px inputs
- Full site navigation now appears from 1024px instead of 1280px; the Apply
  button steps aside in that band so nothing overflows
- Navigation labels no longer wrap onto two lines

Co-Authored-By: Claude Fable 5.1 <noreply@anthropic.com>
</commit_message>
<xml_diff>
--- a/docs/Admin-Panel-User-Guide.docx
+++ b/docs/Admin-Panel-User-Guide.docx
@@ -553,34 +553,30 @@
           <w:sz w:val="22"/>
           <w:szCs w:val="22"/>
         </w:rPr>
-        <w:t xml:space="preserve">Delete:</w:t>
-      </w:r>
-      <w:r>
-        <w:rPr>
-          <w:sz w:val="22"/>
-          <w:szCs w:val="22"/>
-        </w:rPr>
-        <w:t xml:space="preserve"> click the red bin icon and confirm.</w:t>
-      </w:r>
-    </w:p>
-    <w:p>
-      <w:pPr>
-        <w:pStyle w:val="Heading1"/>
-      </w:pPr>
-      <w:r>
-        <w:t xml:space="preserve">4. Events</w:t>
-      </w:r>
-    </w:p>
-    <w:p>
-      <w:pPr>
-        <w:spacing w:after="140"/>
-      </w:pPr>
-      <w:r>
-        <w:rPr>
-          <w:sz w:val="22"/>
-          <w:szCs w:val="22"/>
-        </w:rPr>
-        <w:t xml:space="preserve">Events appear beside the notice board as </w:t>
+        <w:t xml:space="preserve">Active or inactive:</w:t>
+      </w:r>
+      <w:r>
+        <w:rPr>
+          <w:sz w:val="22"/>
+          <w:szCs w:val="22"/>
+        </w:rPr>
+        <w:t xml:space="preserve"> the </w:t>
+      </w:r>
+      <w:r>
+        <w:rPr>
+          <w:b/>
+          <w:bCs/>
+          <w:sz w:val="22"/>
+          <w:szCs w:val="22"/>
+        </w:rPr>
+        <w:t xml:space="preserve">Status</w:t>
+      </w:r>
+      <w:r>
+        <w:rPr>
+          <w:sz w:val="22"/>
+          <w:szCs w:val="22"/>
+        </w:rPr>
+        <w:t xml:space="preserve"> column shows a green </w:t>
       </w:r>
       <w:r>
         <w:rPr>
@@ -589,131 +585,14 @@
           <w:sz w:val="22"/>
           <w:szCs w:val="22"/>
         </w:rPr>
-        <w:t xml:space="preserve">Upcoming Events</w:t>
-      </w:r>
-      <w:r>
-        <w:rPr>
-          <w:sz w:val="22"/>
-          <w:szCs w:val="22"/>
-        </w:rPr>
-        <w:t xml:space="preserve">.</w:t>
-      </w:r>
-    </w:p>
-    <w:p>
-      <w:pPr>
-        <w:pStyle w:val="ListParagraph"/>
-        <w:numPr>
-          <w:ilvl w:val="0"/>
-          <w:numId w:val="3"/>
-        </w:numPr>
-        <w:spacing w:after="70"/>
-      </w:pPr>
-      <w:r>
-        <w:rPr>
-          <w:b/>
-          <w:bCs/>
-          <w:sz w:val="22"/>
-          <w:szCs w:val="22"/>
-        </w:rPr>
-        <w:t xml:space="preserve">Add an event:</w:t>
-      </w:r>
-      <w:r>
-        <w:rPr>
-          <w:sz w:val="22"/>
-          <w:szCs w:val="22"/>
-        </w:rPr>
-        <w:t xml:space="preserve"> click </w:t>
-      </w:r>
-      <w:r>
-        <w:rPr>
-          <w:b/>
-          <w:bCs/>
-          <w:sz w:val="22"/>
-          <w:szCs w:val="22"/>
-        </w:rPr>
-        <w:t xml:space="preserve">Add event</w:t>
-      </w:r>
-      <w:r>
-        <w:rPr>
-          <w:sz w:val="22"/>
-          <w:szCs w:val="22"/>
-        </w:rPr>
-        <w:t xml:space="preserve">, enter the title, date and venue, then </w:t>
-      </w:r>
-      <w:r>
-        <w:rPr>
-          <w:b/>
-          <w:bCs/>
-          <w:sz w:val="22"/>
-          <w:szCs w:val="22"/>
-        </w:rPr>
-        <w:t xml:space="preserve">Publish event</w:t>
-      </w:r>
-      <w:r>
-        <w:rPr>
-          <w:sz w:val="22"/>
-          <w:szCs w:val="22"/>
-        </w:rPr>
-        <w:t xml:space="preserve">.</w:t>
-      </w:r>
-    </w:p>
-    <w:p>
-      <w:pPr>
-        <w:pStyle w:val="ListParagraph"/>
-        <w:numPr>
-          <w:ilvl w:val="0"/>
-          <w:numId w:val="3"/>
-        </w:numPr>
-        <w:spacing w:after="70"/>
-      </w:pPr>
-      <w:r>
-        <w:rPr>
-          <w:b/>
-          <w:bCs/>
-          <w:sz w:val="22"/>
-          <w:szCs w:val="22"/>
-        </w:rPr>
-        <w:t xml:space="preserve">Description (optional):</w:t>
-      </w:r>
-      <w:r>
-        <w:rPr>
-          <w:sz w:val="22"/>
-          <w:szCs w:val="22"/>
-        </w:rPr>
-        <w:t xml:space="preserve"> same rich text field as notices — bold, lists, links and so on. It appears under the event on the Notices page.</w:t>
-      </w:r>
-    </w:p>
-    <w:p>
-      <w:pPr>
-        <w:pStyle w:val="ListParagraph"/>
-        <w:numPr>
-          <w:ilvl w:val="0"/>
-          <w:numId w:val="3"/>
-        </w:numPr>
-        <w:spacing w:after="70"/>
-      </w:pPr>
-      <w:r>
-        <w:rPr>
-          <w:sz w:val="22"/>
-          <w:szCs w:val="22"/>
-        </w:rPr>
-        <w:t xml:space="preserve">Only events dated </w:t>
-      </w:r>
-      <w:r>
-        <w:rPr>
-          <w:b/>
-          <w:bCs/>
-          <w:sz w:val="22"/>
-          <w:szCs w:val="22"/>
-        </w:rPr>
-        <w:t xml:space="preserve">today or later</w:t>
-      </w:r>
-      <w:r>
-        <w:rPr>
-          <w:sz w:val="22"/>
-          <w:szCs w:val="22"/>
-        </w:rPr>
-        <w:t xml:space="preserve"> are shown on the website. Past events stay in your list marked </w:t>
+        <w:t xml:space="preserve">Active</w:t>
+      </w:r>
+      <w:r>
+        <w:rPr>
+          <w:sz w:val="22"/>
+          <w:szCs w:val="22"/>
+        </w:rPr>
+        <w:t xml:space="preserve"> or grey </w:t>
       </w:r>
       <w:r>
         <w:rPr>
@@ -722,6 +601,217 @@
           <w:sz w:val="22"/>
           <w:szCs w:val="22"/>
         </w:rPr>
+        <w:t xml:space="preserve">Inactive</w:t>
+      </w:r>
+      <w:r>
+        <w:rPr>
+          <w:sz w:val="22"/>
+          <w:szCs w:val="22"/>
+        </w:rPr>
+        <w:t xml:space="preserve"> pill. Click it to switch. Inactive notices stay in your list but are hidden from the website — useful for something written in advance or finished for now. You can also set the status while adding or editing.</w:t>
+      </w:r>
+    </w:p>
+    <w:p>
+      <w:pPr>
+        <w:pStyle w:val="ListParagraph"/>
+        <w:numPr>
+          <w:ilvl w:val="0"/>
+          <w:numId w:val="3"/>
+        </w:numPr>
+        <w:spacing w:after="70"/>
+      </w:pPr>
+      <w:r>
+        <w:rPr>
+          <w:b/>
+          <w:bCs/>
+          <w:sz w:val="22"/>
+          <w:szCs w:val="22"/>
+        </w:rPr>
+        <w:t xml:space="preserve">Delete:</w:t>
+      </w:r>
+      <w:r>
+        <w:rPr>
+          <w:sz w:val="22"/>
+          <w:szCs w:val="22"/>
+        </w:rPr>
+        <w:t xml:space="preserve"> click the red bin icon and confirm. Deleting is permanent; use </w:t>
+      </w:r>
+      <w:r>
+        <w:rPr>
+          <w:i/>
+          <w:iCs/>
+          <w:sz w:val="22"/>
+          <w:szCs w:val="22"/>
+        </w:rPr>
+        <w:t xml:space="preserve">Inactive</w:t>
+      </w:r>
+      <w:r>
+        <w:rPr>
+          <w:sz w:val="22"/>
+          <w:szCs w:val="22"/>
+        </w:rPr>
+        <w:t xml:space="preserve"> if you may want it back.</w:t>
+      </w:r>
+    </w:p>
+    <w:p>
+      <w:pPr>
+        <w:pStyle w:val="Heading1"/>
+      </w:pPr>
+      <w:r>
+        <w:t xml:space="preserve">4. Events</w:t>
+      </w:r>
+    </w:p>
+    <w:p>
+      <w:pPr>
+        <w:spacing w:after="140"/>
+      </w:pPr>
+      <w:r>
+        <w:rPr>
+          <w:sz w:val="22"/>
+          <w:szCs w:val="22"/>
+        </w:rPr>
+        <w:t xml:space="preserve">Events appear beside the notice board as </w:t>
+      </w:r>
+      <w:r>
+        <w:rPr>
+          <w:i/>
+          <w:iCs/>
+          <w:sz w:val="22"/>
+          <w:szCs w:val="22"/>
+        </w:rPr>
+        <w:t xml:space="preserve">Upcoming Events</w:t>
+      </w:r>
+      <w:r>
+        <w:rPr>
+          <w:sz w:val="22"/>
+          <w:szCs w:val="22"/>
+        </w:rPr>
+        <w:t xml:space="preserve">.</w:t>
+      </w:r>
+    </w:p>
+    <w:p>
+      <w:pPr>
+        <w:pStyle w:val="ListParagraph"/>
+        <w:numPr>
+          <w:ilvl w:val="0"/>
+          <w:numId w:val="3"/>
+        </w:numPr>
+        <w:spacing w:after="70"/>
+      </w:pPr>
+      <w:r>
+        <w:rPr>
+          <w:b/>
+          <w:bCs/>
+          <w:sz w:val="22"/>
+          <w:szCs w:val="22"/>
+        </w:rPr>
+        <w:t xml:space="preserve">Add an event:</w:t>
+      </w:r>
+      <w:r>
+        <w:rPr>
+          <w:sz w:val="22"/>
+          <w:szCs w:val="22"/>
+        </w:rPr>
+        <w:t xml:space="preserve"> click </w:t>
+      </w:r>
+      <w:r>
+        <w:rPr>
+          <w:b/>
+          <w:bCs/>
+          <w:sz w:val="22"/>
+          <w:szCs w:val="22"/>
+        </w:rPr>
+        <w:t xml:space="preserve">Add event</w:t>
+      </w:r>
+      <w:r>
+        <w:rPr>
+          <w:sz w:val="22"/>
+          <w:szCs w:val="22"/>
+        </w:rPr>
+        <w:t xml:space="preserve">, enter the title, date and venue, then </w:t>
+      </w:r>
+      <w:r>
+        <w:rPr>
+          <w:b/>
+          <w:bCs/>
+          <w:sz w:val="22"/>
+          <w:szCs w:val="22"/>
+        </w:rPr>
+        <w:t xml:space="preserve">Publish event</w:t>
+      </w:r>
+      <w:r>
+        <w:rPr>
+          <w:sz w:val="22"/>
+          <w:szCs w:val="22"/>
+        </w:rPr>
+        <w:t xml:space="preserve">.</w:t>
+      </w:r>
+    </w:p>
+    <w:p>
+      <w:pPr>
+        <w:pStyle w:val="ListParagraph"/>
+        <w:numPr>
+          <w:ilvl w:val="0"/>
+          <w:numId w:val="3"/>
+        </w:numPr>
+        <w:spacing w:after="70"/>
+      </w:pPr>
+      <w:r>
+        <w:rPr>
+          <w:b/>
+          <w:bCs/>
+          <w:sz w:val="22"/>
+          <w:szCs w:val="22"/>
+        </w:rPr>
+        <w:t xml:space="preserve">Description (optional):</w:t>
+      </w:r>
+      <w:r>
+        <w:rPr>
+          <w:sz w:val="22"/>
+          <w:szCs w:val="22"/>
+        </w:rPr>
+        <w:t xml:space="preserve"> same rich text field as notices — bold, lists, links and so on. It appears under the event on the Notices page.</w:t>
+      </w:r>
+    </w:p>
+    <w:p>
+      <w:pPr>
+        <w:pStyle w:val="ListParagraph"/>
+        <w:numPr>
+          <w:ilvl w:val="0"/>
+          <w:numId w:val="3"/>
+        </w:numPr>
+        <w:spacing w:after="70"/>
+      </w:pPr>
+      <w:r>
+        <w:rPr>
+          <w:sz w:val="22"/>
+          <w:szCs w:val="22"/>
+        </w:rPr>
+        <w:t xml:space="preserve">Only events dated </w:t>
+      </w:r>
+      <w:r>
+        <w:rPr>
+          <w:b/>
+          <w:bCs/>
+          <w:sz w:val="22"/>
+          <w:szCs w:val="22"/>
+        </w:rPr>
+        <w:t xml:space="preserve">today or later</w:t>
+      </w:r>
+      <w:r>
+        <w:rPr>
+          <w:sz w:val="22"/>
+          <w:szCs w:val="22"/>
+        </w:rPr>
+        <w:t xml:space="preserve"> are shown on the website. Past events stay in your list marked </w:t>
+      </w:r>
+      <w:r>
+        <w:rPr>
+          <w:i/>
+          <w:iCs/>
+          <w:sz w:val="22"/>
+          <w:szCs w:val="22"/>
+        </w:rPr>
         <w:t xml:space="preserve">Past</w:t>
       </w:r>
       <w:r>
@@ -730,6 +820,32 @@
           <w:szCs w:val="22"/>
         </w:rPr>
         <w:t xml:space="preserve">, so you can edit the date and re-use them next year.</w:t>
+      </w:r>
+    </w:p>
+    <w:p>
+      <w:pPr>
+        <w:pStyle w:val="ListParagraph"/>
+        <w:numPr>
+          <w:ilvl w:val="0"/>
+          <w:numId w:val="3"/>
+        </w:numPr>
+        <w:spacing w:after="70"/>
+      </w:pPr>
+      <w:r>
+        <w:rPr>
+          <w:b/>
+          <w:bCs/>
+          <w:sz w:val="22"/>
+          <w:szCs w:val="22"/>
+        </w:rPr>
+        <w:t xml:space="preserve">Active or inactive:</w:t>
+      </w:r>
+      <w:r>
+        <w:rPr>
+          <w:sz w:val="22"/>
+          <w:szCs w:val="22"/>
+        </w:rPr>
+        <w:t xml:space="preserve"> same switch as notices. An event must be both active and dated today or later to appear on the website.</w:t>
       </w:r>
     </w:p>
     <w:p>
@@ -2104,7 +2220,49 @@
           <w:sz w:val="22"/>
           <w:szCs w:val="22"/>
         </w:rPr>
-        <w:t xml:space="preserve"> delete old notices and past events now and then.</w:t>
+        <w:t xml:space="preserve"> delete old notices and past events now and then, or set them to </w:t>
+      </w:r>
+      <w:r>
+        <w:rPr>
+          <w:i/>
+          <w:iCs/>
+          <w:sz w:val="22"/>
+          <w:szCs w:val="22"/>
+        </w:rPr>
+        <w:t xml:space="preserve">Inactive</w:t>
+      </w:r>
+      <w:r>
+        <w:rPr>
+          <w:sz w:val="22"/>
+          <w:szCs w:val="22"/>
+        </w:rPr>
+        <w:t xml:space="preserve"> if you might need them again.</w:t>
+      </w:r>
+    </w:p>
+    <w:p>
+      <w:pPr>
+        <w:pStyle w:val="ListParagraph"/>
+        <w:numPr>
+          <w:ilvl w:val="0"/>
+          <w:numId w:val="3"/>
+        </w:numPr>
+        <w:spacing w:after="70"/>
+      </w:pPr>
+      <w:r>
+        <w:rPr>
+          <w:b/>
+          <w:bCs/>
+          <w:sz w:val="22"/>
+          <w:szCs w:val="22"/>
+        </w:rPr>
+        <w:t xml:space="preserve">The panel works on a phone, a tablet and any computer.</w:t>
+      </w:r>
+      <w:r>
+        <w:rPr>
+          <w:sz w:val="22"/>
+          <w:szCs w:val="22"/>
+        </w:rPr>
+        <w:t xml:space="preserve"> On smaller screens the menu moves behind the ☰ button and wide tables scroll sideways.</w:t>
       </w:r>
     </w:p>
     <w:p>

</xml_diff>

<commit_message>
Make every piece of website wording editable from the admin panel
New 'Website Text' section with five areas:
- Home page sections: stats band, About (paragraphs, quote, pillars), Academics
  programmes, Why Us, Campus Life, notice headings, Testimonials, admissions
  call to action and the contact intro
- Chairman & Principal names, roles and messages
- Page headings (label, title, introduction) for all eight interior pages
- Laboratories
- School identity and footer: name, established year, tagline, motto, trust
  lines, footer blurb and both footer link lists

Also adds the admission steps and the documents checklist to the existing
Admissions Content form. Content lives in site_settings with the shipped copy
as defaults, so nothing is blank before it is edited. The stats band moved out
of the client hero component into its own server component.

Co-Authored-By: Claude Fable 5.1 <noreply@anthropic.com>
</commit_message>
<xml_diff>
--- a/docs/Admin-Panel-User-Guide.docx
+++ b/docs/Admin-Panel-User-Guide.docx
@@ -1700,7 +1700,7 @@
         <w:pStyle w:val="Heading1"/>
       </w:pPr>
       <w:r>
-        <w:t xml:space="preserve">10. Staff accounts</w:t>
+        <w:t xml:space="preserve">10. Website text</w:t>
       </w:r>
     </w:p>
     <w:p>
@@ -1712,6 +1712,250 @@
           <w:sz w:val="22"/>
           <w:szCs w:val="22"/>
         </w:rPr>
+        <w:t xml:space="preserve">Everything written on the public site can be edited here, section by section. Open </w:t>
+      </w:r>
+      <w:r>
+        <w:rPr>
+          <w:b/>
+          <w:bCs/>
+          <w:sz w:val="22"/>
+          <w:szCs w:val="22"/>
+        </w:rPr>
+        <w:t xml:space="preserve">Website Text</w:t>
+      </w:r>
+      <w:r>
+        <w:rPr>
+          <w:sz w:val="22"/>
+          <w:szCs w:val="22"/>
+        </w:rPr>
+        <w:t xml:space="preserve"> in the menu and pick an area:</w:t>
+      </w:r>
+    </w:p>
+    <w:p>
+      <w:pPr>
+        <w:pStyle w:val="ListParagraph"/>
+        <w:numPr>
+          <w:ilvl w:val="0"/>
+          <w:numId w:val="3"/>
+        </w:numPr>
+        <w:spacing w:after="70"/>
+      </w:pPr>
+      <w:r>
+        <w:rPr>
+          <w:b/>
+          <w:bCs/>
+          <w:sz w:val="22"/>
+          <w:szCs w:val="22"/>
+        </w:rPr>
+        <w:t xml:space="preserve">Home page sections:</w:t>
+      </w:r>
+      <w:r>
+        <w:rPr>
+          <w:sz w:val="22"/>
+          <w:szCs w:val="22"/>
+        </w:rPr>
+        <w:t xml:space="preserve"> the statistics band, the About section with its paragraphs, quote and three pillars, Academics with its programme cards, Why Us, Campus Life, the notice board headings, Testimonials, the admissions call to action and the contact introduction.</w:t>
+      </w:r>
+    </w:p>
+    <w:p>
+      <w:pPr>
+        <w:pStyle w:val="ListParagraph"/>
+        <w:numPr>
+          <w:ilvl w:val="0"/>
+          <w:numId w:val="3"/>
+        </w:numPr>
+        <w:spacing w:after="70"/>
+      </w:pPr>
+      <w:r>
+        <w:rPr>
+          <w:b/>
+          <w:bCs/>
+          <w:sz w:val="22"/>
+          <w:szCs w:val="22"/>
+        </w:rPr>
+        <w:t xml:space="preserve">Chairman &amp; Principal:</w:t>
+      </w:r>
+      <w:r>
+        <w:rPr>
+          <w:sz w:val="22"/>
+          <w:szCs w:val="22"/>
+        </w:rPr>
+        <w:t xml:space="preserve"> names, roles and the full message on each page. One blank line starts a new paragraph.</w:t>
+      </w:r>
+    </w:p>
+    <w:p>
+      <w:pPr>
+        <w:pStyle w:val="ListParagraph"/>
+        <w:numPr>
+          <w:ilvl w:val="0"/>
+          <w:numId w:val="3"/>
+        </w:numPr>
+        <w:spacing w:after="70"/>
+      </w:pPr>
+      <w:r>
+        <w:rPr>
+          <w:b/>
+          <w:bCs/>
+          <w:sz w:val="22"/>
+          <w:szCs w:val="22"/>
+        </w:rPr>
+        <w:t xml:space="preserve">Page headings:</w:t>
+      </w:r>
+      <w:r>
+        <w:rPr>
+          <w:sz w:val="22"/>
+          <w:szCs w:val="22"/>
+        </w:rPr>
+        <w:t xml:space="preserve"> the blue band at the top of each interior page — the small label, the title and the introduction.</w:t>
+      </w:r>
+    </w:p>
+    <w:p>
+      <w:pPr>
+        <w:pStyle w:val="ListParagraph"/>
+        <w:numPr>
+          <w:ilvl w:val="0"/>
+          <w:numId w:val="3"/>
+        </w:numPr>
+        <w:spacing w:after="70"/>
+      </w:pPr>
+      <w:r>
+        <w:rPr>
+          <w:b/>
+          <w:bCs/>
+          <w:sz w:val="22"/>
+          <w:szCs w:val="22"/>
+        </w:rPr>
+        <w:t xml:space="preserve">Laboratories:</w:t>
+      </w:r>
+      <w:r>
+        <w:rPr>
+          <w:sz w:val="22"/>
+          <w:szCs w:val="22"/>
+        </w:rPr>
+        <w:t xml:space="preserve"> the laboratories listed on the Labs page.</w:t>
+      </w:r>
+    </w:p>
+    <w:p>
+      <w:pPr>
+        <w:pStyle w:val="ListParagraph"/>
+        <w:numPr>
+          <w:ilvl w:val="0"/>
+          <w:numId w:val="3"/>
+        </w:numPr>
+        <w:spacing w:after="70"/>
+      </w:pPr>
+      <w:r>
+        <w:rPr>
+          <w:b/>
+          <w:bCs/>
+          <w:sz w:val="22"/>
+          <w:szCs w:val="22"/>
+        </w:rPr>
+        <w:t xml:space="preserve">School identity &amp; footer:</w:t>
+      </w:r>
+      <w:r>
+        <w:rPr>
+          <w:sz w:val="22"/>
+          <w:szCs w:val="22"/>
+        </w:rPr>
+        <w:t xml:space="preserve"> school name, established year, tagline, motto, the two trust lines, the footer paragraph and the footer link lists.</w:t>
+      </w:r>
+    </w:p>
+    <w:p>
+      <w:pPr>
+        <w:spacing w:after="140"/>
+      </w:pPr>
+      <w:r>
+        <w:rPr>
+          <w:sz w:val="22"/>
+          <w:szCs w:val="22"/>
+        </w:rPr>
+        <w:t xml:space="preserve">Rows can be re-ordered with ↑ ↓, removed with the bin, and added with the </w:t>
+      </w:r>
+      <w:r>
+        <w:rPr>
+          <w:b/>
+          <w:bCs/>
+          <w:sz w:val="22"/>
+          <w:szCs w:val="22"/>
+        </w:rPr>
+        <w:t xml:space="preserve">Add</w:t>
+      </w:r>
+      <w:r>
+        <w:rPr>
+          <w:sz w:val="22"/>
+          <w:szCs w:val="22"/>
+        </w:rPr>
+        <w:t xml:space="preserve"> button. In the About paragraphs you can write </w:t>
+      </w:r>
+      <w:r>
+        <w:rPr>
+          <w:rFonts w:ascii="Consolas" w:cs="Consolas" w:eastAsia="Consolas" w:hAnsi="Consolas"/>
+          <w:color w:val="1F2E5C"/>
+          <w:sz w:val="20"/>
+          <w:szCs w:val="20"/>
+          <w:shd w:fill="F3F5FA" w:color="auto" w:val="clear"/>
+        </w:rPr>
+        <w:t xml:space="preserve">{year}</w:t>
+      </w:r>
+      <w:r>
+        <w:rPr>
+          <w:sz w:val="22"/>
+          <w:szCs w:val="22"/>
+        </w:rPr>
+        <w:t xml:space="preserve"> for the established year and </w:t>
+      </w:r>
+      <w:r>
+        <w:rPr>
+          <w:rFonts w:ascii="Consolas" w:cs="Consolas" w:eastAsia="Consolas" w:hAnsi="Consolas"/>
+          <w:color w:val="1F2E5C"/>
+          <w:sz w:val="20"/>
+          <w:szCs w:val="20"/>
+          <w:shd w:fill="F3F5FA" w:color="auto" w:val="clear"/>
+        </w:rPr>
+        <w:t xml:space="preserve">{shortName}</w:t>
+      </w:r>
+      <w:r>
+        <w:rPr>
+          <w:sz w:val="22"/>
+          <w:szCs w:val="22"/>
+        </w:rPr>
+        <w:t xml:space="preserve"> for the short school name. Click </w:t>
+      </w:r>
+      <w:r>
+        <w:rPr>
+          <w:b/>
+          <w:bCs/>
+          <w:sz w:val="22"/>
+          <w:szCs w:val="22"/>
+        </w:rPr>
+        <w:t xml:space="preserve">Save &amp; publish</w:t>
+      </w:r>
+      <w:r>
+        <w:rPr>
+          <w:sz w:val="22"/>
+          <w:szCs w:val="22"/>
+        </w:rPr>
+        <w:t xml:space="preserve"> at the bottom; the website updates straight away.</w:t>
+      </w:r>
+    </w:p>
+    <w:p>
+      <w:pPr>
+        <w:pStyle w:val="Heading1"/>
+      </w:pPr>
+      <w:r>
+        <w:t xml:space="preserve">11. Staff accounts</w:t>
+      </w:r>
+    </w:p>
+    <w:p>
+      <w:pPr>
+        <w:spacing w:after="140"/>
+      </w:pPr>
+      <w:r>
+        <w:rPr>
+          <w:sz w:val="22"/>
+          <w:szCs w:val="22"/>
+        </w:rPr>
         <w:t xml:space="preserve">Anyone who needs to update the website gets their own account, so you can see who changed what and remove access when someone leaves.</w:t>
       </w:r>
     </w:p>
@@ -1910,7 +2154,7 @@
         <w:pStyle w:val="Heading1"/>
       </w:pPr>
       <w:r>
-        <w:t xml:space="preserve">11. Activity log</w:t>
+        <w:t xml:space="preserve">12. Activity log</w:t>
       </w:r>
     </w:p>
     <w:p>
@@ -2132,7 +2376,7 @@
         <w:pStyle w:val="Heading1"/>
       </w:pPr>
       <w:r>
-        <w:t xml:space="preserve">12. Account &amp; Password</w:t>
+        <w:t xml:space="preserve">13. Account &amp; Password</w:t>
       </w:r>
     </w:p>
     <w:p>
@@ -2152,7 +2396,7 @@
         <w:pStyle w:val="Heading1"/>
       </w:pPr>
       <w:r>
-        <w:t xml:space="preserve">13. Good habits</w:t>
+        <w:t xml:space="preserve">14. Good habits</w:t>
       </w:r>
     </w:p>
     <w:p>
@@ -2348,7 +2592,7 @@
         <w:pStyle w:val="Heading1"/>
       </w:pPr>
       <w:r>
-        <w:t xml:space="preserve">14. If something goes wrong</w:t>
+        <w:t xml:space="preserve">15. If something goes wrong</w:t>
       </w:r>
     </w:p>
     <w:tbl>

</xml_diff>

<commit_message>
Describe the formatting boxes in the staff user guide
Co-Authored-By: Claude Fable 5.1 <noreply@anthropic.com>
</commit_message>
<xml_diff>
--- a/docs/Admin-Panel-User-Guide.docx
+++ b/docs/Admin-Panel-User-Guide.docx
@@ -1780,7 +1780,7 @@
           <w:sz w:val="22"/>
           <w:szCs w:val="22"/>
         </w:rPr>
-        <w:t xml:space="preserve"> names, roles and the full message on each page. One blank line starts a new paragraph.</w:t>
+        <w:t xml:space="preserve"> names, roles and the full message on each page. The message is a formatting box, so you can make words bold or italic and add bullet points, a quote or a link.</w:t>
       </w:r>
     </w:p>
     <w:p>
@@ -1937,6 +1937,18 @@
           <w:szCs w:val="22"/>
         </w:rPr>
         <w:t xml:space="preserve"> at the bottom; the website updates straight away.</w:t>
+      </w:r>
+    </w:p>
+    <w:p>
+      <w:pPr>
+        <w:spacing w:after="140"/>
+      </w:pPr>
+      <w:r>
+        <w:rPr>
+          <w:sz w:val="22"/>
+          <w:szCs w:val="22"/>
+        </w:rPr>
+        <w:t xml:space="preserve">Longer pieces of writing use the same formatting box as a notice description, with buttons for bold, italic, bullet points, numbered lists, a quote and a link. Those are the two leadership messages, the About paragraphs, each laboratory description, the footer paragraph, the note under the fee table on the Admissions page and the note on the School Timings page. Titles, labels, headings and statistics stay plain text, because the website styles those itself.</w:t>
       </w:r>
     </w:p>
     <w:p>

</xml_diff>

<commit_message>
Let staff manage the header menu from the admin panel
Website Text gains a Header menu screen: add an item, rename it, change where
it points, move it up or down, remove it, and give it a dropdown of links with
the small grey line underneath each one. The gold apply button beside the menu
is set there too, with a longer wording for the phone menu where there is room.

A menu is two levels deep, which the row editor cannot express, so the editor
holds it in state and posts it as one field. The server rebuilds it from
scratch rather than trusting what arrives: it keeps only the known fields,
caps the counts, and accepts only a path, a full web address, an email link or
a telephone link, so a menu can never carry a script address.

Co-Authored-By: Claude Fable 5.1 <noreply@anthropic.com>
</commit_message>
<xml_diff>
--- a/docs/Admin-Panel-User-Guide.docx
+++ b/docs/Admin-Panel-User-Guide.docx
@@ -1729,6 +1729,49 @@
           <w:szCs w:val="22"/>
         </w:rPr>
         <w:t xml:space="preserve"> in the menu and pick an area:</w:t>
+      </w:r>
+    </w:p>
+    <w:p>
+      <w:pPr>
+        <w:pStyle w:val="ListParagraph"/>
+        <w:numPr>
+          <w:ilvl w:val="0"/>
+          <w:numId w:val="3"/>
+        </w:numPr>
+        <w:spacing w:after="70"/>
+      </w:pPr>
+      <w:r>
+        <w:rPr>
+          <w:b/>
+          <w:bCs/>
+          <w:sz w:val="22"/>
+          <w:szCs w:val="22"/>
+        </w:rPr>
+        <w:t xml:space="preserve">Header menu:</w:t>
+      </w:r>
+      <w:r>
+        <w:rPr>
+          <w:sz w:val="22"/>
+          <w:szCs w:val="22"/>
+        </w:rPr>
+        <w:t xml:space="preserve"> the menu across the top of every page. Rename an item, change where it goes, move it up or down, remove it, or add a new one. An item with links underneath it becomes a dropdown. The gold apply button is set here too. Addresses beginning with </w:t>
+      </w:r>
+      <w:r>
+        <w:rPr>
+          <w:rFonts w:ascii="Consolas" w:cs="Consolas" w:eastAsia="Consolas" w:hAnsi="Consolas"/>
+          <w:color w:val="1F2E5C"/>
+          <w:sz w:val="20"/>
+          <w:szCs w:val="20"/>
+          <w:shd w:fill="F3F5FA" w:color="auto" w:val="clear"/>
+        </w:rPr>
+        <w:t xml:space="preserve">/</w:t>
+      </w:r>
+      <w:r>
+        <w:rPr>
+          <w:sz w:val="22"/>
+          <w:szCs w:val="22"/>
+        </w:rPr>
+        <w:t xml:space="preserve"> stay on this website.</w:t>
       </w:r>
     </w:p>
     <w:p>

</xml_diff>